<commit_message>
open ai integration was done
</commit_message>
<xml_diff>
--- a/temp_test/input.docx
+++ b/temp_test/input.docx
@@ -303,10 +303,130 @@
           </w:p>
         </w:tc>
       </w:tr>
+      <w:tr>
+        <w:tc>
+          <w:tcPr>
+            <w:tcW w:type="dxa" w:w="4320"/>
+          </w:tcPr>
+          <w:p>
+            <w:r>
+              <w:t>Draft Submission</w:t>
+            </w:r>
+          </w:p>
+        </w:tc>
+        <w:tc>
+          <w:tcPr>
+            <w:tcW w:type="dxa" w:w="4320"/>
+          </w:tcPr>
+          <w:p>
+            <w:r>
+              <w:t>25th October 2026</w:t>
+            </w:r>
+          </w:p>
+        </w:tc>
+      </w:tr>
+      <w:tr>
+        <w:tc>
+          <w:tcPr>
+            <w:tcW w:type="dxa" w:w="4320"/>
+          </w:tcPr>
+          <w:p>
+            <w:r>
+              <w:t>Draft Submission (Mandatory)</w:t>
+            </w:r>
+          </w:p>
+        </w:tc>
+        <w:tc>
+          <w:tcPr>
+            <w:tcW w:type="dxa" w:w="4320"/>
+          </w:tcPr>
+          <w:p>
+            <w:r>
+              <w:t>26th October 2026</w:t>
+            </w:r>
+          </w:p>
+        </w:tc>
+      </w:tr>
+      <w:tr>
+        <w:tc>
+          <w:tcPr>
+            <w:tcW w:type="dxa" w:w="4320"/>
+          </w:tcPr>
+          <w:p>
+            <w:r>
+              <w:t>Formative Submission</w:t>
+            </w:r>
+          </w:p>
+        </w:tc>
+        <w:tc>
+          <w:tcPr>
+            <w:tcW w:type="dxa" w:w="4320"/>
+          </w:tcPr>
+          <w:p>
+            <w:r>
+              <w:t>27th October 2026</w:t>
+            </w:r>
+          </w:p>
+        </w:tc>
+      </w:tr>
+      <w:tr>
+        <w:tc>
+          <w:tcPr>
+            <w:tcW w:type="dxa" w:w="4320"/>
+          </w:tcPr>
+          <w:p>
+            <w:r>
+              <w:t>Date and Time of Submission</w:t>
+            </w:r>
+          </w:p>
+        </w:tc>
+        <w:tc>
+          <w:tcPr>
+            <w:tcW w:type="dxa" w:w="4320"/>
+          </w:tcPr>
+          <w:p>
+            <w:r>
+              <w:t>29th October 2026</w:t>
+            </w:r>
+          </w:p>
+        </w:tc>
+      </w:tr>
+      <w:tr>
+        <w:tc>
+          <w:tcPr>
+            <w:tcW w:type="dxa" w:w="4320"/>
+          </w:tcPr>
+          <w:p>
+            <w:r>
+              <w:t>Submission Date &amp; Time</w:t>
+            </w:r>
+          </w:p>
+        </w:tc>
+        <w:tc>
+          <w:tcPr>
+            <w:tcW w:type="dxa" w:w="4320"/>
+          </w:tcPr>
+          <w:p>
+            <w:r>
+              <w:t>30th October 2026</w:t>
+            </w:r>
+          </w:p>
+        </w:tc>
+      </w:tr>
     </w:tbl>
     <w:p>
       <w:r>
         <w:t>Website: www.harvard.edu/admissions</w:t>
+      </w:r>
+    </w:p>
+    <w:p>
+      <w:r>
+        <w:t>Draft Submission (Mandatory): 28th October 2026</w:t>
+      </w:r>
+    </w:p>
+    <w:p>
+      <w:r>
+        <w:t>Date and Time of Submission: 31st October 2026</w:t>
       </w:r>
     </w:p>
     <w:p>

</xml_diff>

<commit_message>
engine and ai improvization was done
</commit_message>
<xml_diff>
--- a/temp_test/input.docx
+++ b/temp_test/input.docx
@@ -451,6 +451,16 @@
     </w:p>
     <w:p>
       <w:r>
+        <w:t>Academic Year 2025-26</w:t>
+      </w:r>
+    </w:p>
+    <w:p>
+      <w:r>
+        <w:t>Module Code: BM414</w:t>
+      </w:r>
+    </w:p>
+    <w:p>
+      <w:r>
         <w:t>Submission location: Turnitin VLE online portal</w:t>
       </w:r>
     </w:p>

</xml_diff>